<commit_message>
Add TypeScript and JMeter to skills; JMeter to QAT tools; Postman to Micro Focus tools; refresh resume files
</commit_message>
<xml_diff>
--- a/assets/Johnny_Chacon_Gairaud_Resume.docx
+++ b/assets/Johnny_Chacon_Gairaud_Resume.docx
@@ -1008,7 +1008,7 @@
           <w:szCs w:val="19"/>
           <w:lang w:val="en-US"/>
         </w:rPr>
-        <w:t>SoapUI</w:t>
+        <w:t xml:space="preserve">SoapUI   ·   JMeter</w:t>
       </w:r>
       <w:r>
         <w:rPr>
@@ -2982,7 +2982,7 @@
           <w:color w:val="1F2937"/>
           <w:lang w:val="en-US"/>
         </w:rPr>
-        <w:t>C++, Java EE, Python, JavaScript, Perl</w:t>
+        <w:t>C++, Java EE, Python, JavaScript, TypeScript, Perl</w:t>
       </w:r>
     </w:p>
     <w:p>
@@ -3018,7 +3018,7 @@
           <w:color w:val="1F2937"/>
           <w:lang w:val="en-US"/>
         </w:rPr>
-        <w:t>Selenium (Python &amp; Java), TestNG, Playwright, Cypress, Postman, SoapUI</w:t>
+        <w:t>Selenium (Python &amp; Java), TestNG, Playwright, Cypress, Postman, SoapUI, JMeter</w:t>
       </w:r>
     </w:p>
     <w:p>

</xml_diff>